<commit_message>
correccciones auditoria de flujos
</commit_message>
<xml_diff>
--- a/Informe_Arquitectura_Flujos_App_Usuario.docx
+++ b/Informe_Arquitectura_Flujos_App_Usuario.docx
@@ -424,7 +424,7 @@
               <w:rPr>
                 <w:sz w:val="18"/>
               </w:rPr>
-              <w:t>CRÍTICO (P0)</w:t>
+              <w:t>CRÍTICO (P0) [REMEDIADO]</w:t>
             </w:r>
           </w:p>
         </w:tc>
@@ -452,7 +452,7 @@
               <w:rPr>
                 <w:sz w:val="18"/>
               </w:rPr>
-              <w:t>Deadlock circular y componentes huérfanos (AceptarCotizacion, PagoTraslado, PagoRecuperable no importados en [id]/page.tsx).</w:t>
+              <w:t>Deadlock circular y componentes huérfanos resuelto: AceptarCotizacion, PagoTraslado y PagoRecuperable integrados y operativos en [id]/page.tsx.</w:t>
             </w:r>
           </w:p>
         </w:tc>
@@ -466,7 +466,7 @@
               <w:rPr>
                 <w:sz w:val="18"/>
               </w:rPr>
-              <w:t>El usuario no puede aceptar cotizaciones diferidas ni pagar fuera del wizard inicial.</w:t>
+              <w:t>REMEDIADO: El usuario ahora puede confirmar cotizaciones diferidas y completar el pago anticipado o final directamente en su Pasaporte Digital.</w:t>
             </w:r>
           </w:p>
         </w:tc>
@@ -496,7 +496,7 @@
               <w:rPr>
                 <w:sz w:val="18"/>
               </w:rPr>
-              <w:t>CRÍTICO (P0)</w:t>
+              <w:t>CRÍTICO (P0) [REMEDIADO]</w:t>
             </w:r>
           </w:p>
         </w:tc>
@@ -524,7 +524,7 @@
               <w:rPr>
                 <w:sz w:val="18"/>
               </w:rPr>
-              <w:t>Falla por discrepancia de esquema en FormularioSoporte.tsx (columna 'creado_por' y enums inválidos como 'pagos', 'evidencia').</w:t>
+              <w:t>Falla por discrepancia de esquema resuelta: FormularioSoporte.tsx migrado al servicio canónico reportarIncidencia() con enums válidos y auditoría.</w:t>
             </w:r>
           </w:p>
         </w:tc>
@@ -538,7 +538,7 @@
               <w:rPr>
                 <w:sz w:val="18"/>
               </w:rPr>
-              <w:t>El insert en Supabase falla al 100%; se degrada silenciosamente a mailto: sin generar ticket.</w:t>
+              <w:t>REMEDIADO: Los tickets de soporte con viaje se insertan de forma atómica en incidencias con folio oficial y seguimiento en Torre de Control.</w:t>
             </w:r>
           </w:p>
         </w:tc>
@@ -568,7 +568,7 @@
               <w:rPr>
                 <w:sz w:val="18"/>
               </w:rPr>
-              <w:t>ALTO (P1)</w:t>
+              <w:t>ALTO (P1) [REMEDIADO]</w:t>
             </w:r>
           </w:p>
         </w:tc>
@@ -596,7 +596,7 @@
               <w:rPr>
                 <w:sz w:val="18"/>
               </w:rPr>
-              <w:t>Botón de cancelación visible en estados no cancelables (en tránsito, recolección, verificación).</w:t>
+              <w:t>Validación preventiva integrada: CancelarTraslado.tsx sincronizado con usuarioPuedeCancelar() y aviso de contingencia a soporte/chat.</w:t>
             </w:r>
           </w:p>
         </w:tc>
@@ -610,7 +610,7 @@
               <w:rPr>
                 <w:sz w:val="18"/>
               </w:rPr>
-              <w:t>El usuario cree poder cancelar en ruta y recibe error bloqueante de Postgres al confirmar.</w:t>
+              <w:t>REMEDIADO: La UI ya no permite intentar cancelaciones en etapas no cancelables; informa claramente y redirige a los canales de asistencia.</w:t>
             </w:r>
           </w:p>
         </w:tc>

</xml_diff>